<commit_message>
Remove outdated Excel and CSV files; update regulations for market sessions
</commit_message>
<xml_diff>
--- a/public/docs/regolamento-news-stampare.docx
+++ b/public/docs/regolamento-news-stampare.docx
@@ -43,7 +43,7 @@
           <w:b/>
           <w:bCs/>
         </w:rPr>
-        <w:t>1. Parametri Generali della Sessione</w:t>
+        <w:t>Parametri Generali della Sessione</w:t>
       </w:r>
     </w:p>
     <w:p>
@@ -138,6 +138,201 @@
     </w:p>
     <w:p>
       <w:pPr>
+        <w:pStyle w:val="Paragrafoelenco"/>
+        <w:numPr>
+          <w:ilvl w:val="0"/>
+          <w:numId w:val="7"/>
+        </w:numPr>
+        <w:rPr>
+          <w:b/>
+          <w:bCs/>
+        </w:rPr>
+      </w:pPr>
+      <w:r>
+        <w:rPr>
+          <w:b/>
+          <w:bCs/>
+        </w:rPr>
+        <w:t xml:space="preserve">Asta in Chiaro (Rilancio in </w:t>
+      </w:r>
+      <w:proofErr w:type="gramStart"/>
+      <w:r>
+        <w:rPr>
+          <w:b/>
+          <w:bCs/>
+        </w:rPr>
+        <w:t>Euro</w:t>
+      </w:r>
+      <w:proofErr w:type="gramEnd"/>
+      <w:r>
+        <w:rPr>
+          <w:b/>
+          <w:bCs/>
+        </w:rPr>
+        <w:t>)</w:t>
+      </w:r>
+    </w:p>
+    <w:p>
+      <w:pPr>
+        <w:numPr>
+          <w:ilvl w:val="0"/>
+          <w:numId w:val="5"/>
+        </w:numPr>
+      </w:pPr>
+      <w:r>
+        <w:rPr>
+          <w:b/>
+          <w:bCs/>
+        </w:rPr>
+        <w:t>Valuta d'asta:</w:t>
+      </w:r>
+      <w:r>
+        <w:t xml:space="preserve"> Rilanci esclusivamente in euro (soldi reali).</w:t>
+      </w:r>
+    </w:p>
+    <w:p>
+      <w:pPr>
+        <w:numPr>
+          <w:ilvl w:val="0"/>
+          <w:numId w:val="5"/>
+        </w:numPr>
+      </w:pPr>
+      <w:r>
+        <w:rPr>
+          <w:b/>
+          <w:bCs/>
+        </w:rPr>
+        <w:t>Funzionamento e Visibilità:</w:t>
+      </w:r>
+    </w:p>
+    <w:p>
+      <w:pPr>
+        <w:numPr>
+          <w:ilvl w:val="1"/>
+          <w:numId w:val="5"/>
+        </w:numPr>
+      </w:pPr>
+      <w:r>
+        <w:t xml:space="preserve">Tutti i rilanci e le offerte sono </w:t>
+      </w:r>
+      <w:r>
+        <w:rPr>
+          <w:b/>
+          <w:bCs/>
+        </w:rPr>
+        <w:t>pubblici e visibili</w:t>
+      </w:r>
+      <w:r>
+        <w:t xml:space="preserve"> in tempo reale a tutti i presidenti.</w:t>
+      </w:r>
+    </w:p>
+    <w:p>
+      <w:pPr>
+        <w:numPr>
+          <w:ilvl w:val="1"/>
+          <w:numId w:val="5"/>
+        </w:numPr>
+      </w:pPr>
+      <w:r>
+        <w:rPr>
+          <w:b/>
+          <w:bCs/>
+        </w:rPr>
+        <w:t>Timer di 24 ore:</w:t>
+      </w:r>
+      <w:r>
+        <w:t xml:space="preserve"> Alla prima offerta ricevuta su un determinato giocatore si attiva un conto alla rovescia di 24 ore.</w:t>
+      </w:r>
+    </w:p>
+    <w:p>
+      <w:pPr>
+        <w:numPr>
+          <w:ilvl w:val="0"/>
+          <w:numId w:val="5"/>
+        </w:numPr>
+      </w:pPr>
+      <w:r>
+        <w:rPr>
+          <w:b/>
+          <w:bCs/>
+        </w:rPr>
+        <w:t>Aggiudicazione e Chiusura:</w:t>
+      </w:r>
+    </w:p>
+    <w:p>
+      <w:pPr>
+        <w:numPr>
+          <w:ilvl w:val="1"/>
+          <w:numId w:val="5"/>
+        </w:numPr>
+      </w:pPr>
+      <w:r>
+        <w:t xml:space="preserve">Il giocatore viene aggiudicato al miglior offerente allo scadere delle 24 ore oppure alla </w:t>
+      </w:r>
+      <w:r>
+        <w:rPr>
+          <w:i/>
+          <w:iCs/>
+        </w:rPr>
+        <w:t>Data chiusura</w:t>
+      </w:r>
+      <w:r>
+        <w:t xml:space="preserve"> generale della sessione (se questa scade prima del timer).</w:t>
+      </w:r>
+    </w:p>
+    <w:p>
+      <w:pPr>
+        <w:numPr>
+          <w:ilvl w:val="1"/>
+          <w:numId w:val="5"/>
+        </w:numPr>
+      </w:pPr>
+      <w:r>
+        <w:t xml:space="preserve">Rispetta il limite massimo di </w:t>
+      </w:r>
+      <w:r>
+        <w:rPr>
+          <w:i/>
+          <w:iCs/>
+        </w:rPr>
+        <w:t>Acquisti effettivi</w:t>
+      </w:r>
+      <w:r>
+        <w:t xml:space="preserve"> impostato per la squadra.</w:t>
+      </w:r>
+    </w:p>
+    <w:p>
+      <w:pPr>
+        <w:numPr>
+          <w:ilvl w:val="1"/>
+          <w:numId w:val="5"/>
+        </w:numPr>
+      </w:pPr>
+      <w:r>
+        <w:t>All'aggiudicazione si procede all'acquisto dichiarando il giocatore da cedere.</w:t>
+      </w:r>
+    </w:p>
+    <w:p>
+      <w:pPr>
+        <w:numPr>
+          <w:ilvl w:val="0"/>
+          <w:numId w:val="5"/>
+        </w:numPr>
+      </w:pPr>
+      <w:r>
+        <w:rPr>
+          <w:b/>
+          <w:bCs/>
+        </w:rPr>
+        <w:t>Budget e Bonus:</w:t>
+      </w:r>
+      <w:r>
+        <w:t xml:space="preserve"> Non sono previsti extra bonus e le offerte non sono vincolate ai crediti di fantamercato (Fantamilioni).</w:t>
+      </w:r>
+    </w:p>
+    <w:p/>
+    <w:p>
+      <w:pPr>
         <w:rPr>
           <w:b/>
           <w:bCs/>
@@ -260,6 +455,7 @@
         </w:numPr>
       </w:pPr>
       <w:r>
+        <w:lastRenderedPageBreak/>
         <w:t>Per ogni giocatore vince l'offerta più alta; a parità di prezzo prevale l'offerta inviata prima (</w:t>
       </w:r>
       <w:proofErr w:type="spellStart"/>
@@ -331,200 +527,10 @@
         <w:t xml:space="preserve"> Non sono previsti extra bonus se si gioca in euro; se impostata in Fantamilioni si aggiunge un extra bonus di 30 FM ai crediti rimanenti.</w:t>
       </w:r>
     </w:p>
-    <w:p>
-      <w:pPr>
-        <w:rPr>
-          <w:b/>
-          <w:bCs/>
-        </w:rPr>
-      </w:pPr>
-      <w:r>
-        <w:rPr>
-          <w:b/>
-          <w:bCs/>
-        </w:rPr>
-        <w:t xml:space="preserve">3. Asta in Chiaro (Rilancio in </w:t>
-      </w:r>
-      <w:proofErr w:type="gramStart"/>
-      <w:r>
-        <w:rPr>
-          <w:b/>
-          <w:bCs/>
-        </w:rPr>
-        <w:t>Euro</w:t>
-      </w:r>
-      <w:proofErr w:type="gramEnd"/>
-      <w:r>
-        <w:rPr>
-          <w:b/>
-          <w:bCs/>
-        </w:rPr>
-        <w:t>)</w:t>
-      </w:r>
-    </w:p>
-    <w:p>
-      <w:pPr>
-        <w:numPr>
-          <w:ilvl w:val="0"/>
-          <w:numId w:val="5"/>
-        </w:numPr>
-      </w:pPr>
-      <w:r>
-        <w:rPr>
-          <w:b/>
-          <w:bCs/>
-        </w:rPr>
-        <w:t>Valuta d'asta:</w:t>
-      </w:r>
-      <w:r>
-        <w:t xml:space="preserve"> Rilanci esclusivamente in euro (soldi reali).</w:t>
-      </w:r>
-    </w:p>
-    <w:p>
-      <w:pPr>
-        <w:numPr>
-          <w:ilvl w:val="0"/>
-          <w:numId w:val="5"/>
-        </w:numPr>
-      </w:pPr>
-      <w:r>
-        <w:rPr>
-          <w:b/>
-          <w:bCs/>
-        </w:rPr>
-        <w:t>Funzionamento e Visibilità:</w:t>
-      </w:r>
-    </w:p>
-    <w:p>
-      <w:pPr>
-        <w:numPr>
-          <w:ilvl w:val="1"/>
-          <w:numId w:val="5"/>
-        </w:numPr>
-      </w:pPr>
-      <w:r>
-        <w:t xml:space="preserve">Tutti i rilanci e le offerte sono </w:t>
-      </w:r>
-      <w:r>
-        <w:rPr>
-          <w:b/>
-          <w:bCs/>
-        </w:rPr>
-        <w:t>pubblici e visibili</w:t>
-      </w:r>
-      <w:r>
-        <w:t xml:space="preserve"> in tempo reale a tutti i presidenti.</w:t>
-      </w:r>
-    </w:p>
-    <w:p>
-      <w:pPr>
-        <w:numPr>
-          <w:ilvl w:val="1"/>
-          <w:numId w:val="5"/>
-        </w:numPr>
-      </w:pPr>
-      <w:r>
-        <w:rPr>
-          <w:b/>
-          <w:bCs/>
-        </w:rPr>
-        <w:t>Timer di 24 ore:</w:t>
-      </w:r>
-      <w:r>
-        <w:t xml:space="preserve"> Alla prima offerta ricevuta su un determinato giocatore si attiva un conto alla rovescia di 24 ore.</w:t>
-      </w:r>
-    </w:p>
-    <w:p>
-      <w:pPr>
-        <w:numPr>
-          <w:ilvl w:val="0"/>
-          <w:numId w:val="5"/>
-        </w:numPr>
-      </w:pPr>
-      <w:r>
-        <w:rPr>
-          <w:b/>
-          <w:bCs/>
-        </w:rPr>
-        <w:t>Aggiudicazione e Chiusura:</w:t>
-      </w:r>
-    </w:p>
-    <w:p>
-      <w:pPr>
-        <w:numPr>
-          <w:ilvl w:val="1"/>
-          <w:numId w:val="5"/>
-        </w:numPr>
-      </w:pPr>
-      <w:r>
-        <w:lastRenderedPageBreak/>
-        <w:t xml:space="preserve">Il giocatore viene aggiudicato al miglior offerente allo scadere delle 24 ore oppure alla </w:t>
-      </w:r>
-      <w:r>
-        <w:rPr>
-          <w:i/>
-          <w:iCs/>
-        </w:rPr>
-        <w:t>Data chiusura</w:t>
-      </w:r>
-      <w:r>
-        <w:t xml:space="preserve"> generale della sessione (se questa scade prima del timer).</w:t>
-      </w:r>
-    </w:p>
-    <w:p>
-      <w:pPr>
-        <w:numPr>
-          <w:ilvl w:val="1"/>
-          <w:numId w:val="5"/>
-        </w:numPr>
-      </w:pPr>
-      <w:r>
-        <w:t xml:space="preserve">Rispetta il limite massimo di </w:t>
-      </w:r>
-      <w:r>
-        <w:rPr>
-          <w:i/>
-          <w:iCs/>
-        </w:rPr>
-        <w:t>Acquisti effettivi</w:t>
-      </w:r>
-      <w:r>
-        <w:t xml:space="preserve"> impostato per la squadra.</w:t>
-      </w:r>
-    </w:p>
-    <w:p>
-      <w:pPr>
-        <w:numPr>
-          <w:ilvl w:val="1"/>
-          <w:numId w:val="5"/>
-        </w:numPr>
-      </w:pPr>
-      <w:r>
-        <w:t>All'aggiudicazione si procede all'acquisto dichiarando il giocatore da cedere.</w:t>
-      </w:r>
-    </w:p>
-    <w:p>
-      <w:pPr>
-        <w:numPr>
-          <w:ilvl w:val="0"/>
-          <w:numId w:val="5"/>
-        </w:numPr>
-      </w:pPr>
-      <w:r>
-        <w:rPr>
-          <w:b/>
-          <w:bCs/>
-        </w:rPr>
-        <w:t>Budget e Bonus:</w:t>
-      </w:r>
-      <w:r>
-        <w:t xml:space="preserve"> Non sono previsti extra bonus e le offerte non sono vincolate ai crediti di fantamercato (Fantamilioni).</w:t>
-      </w:r>
-    </w:p>
     <w:p/>
     <w:p>
       <w:pPr>
-        <w:pStyle w:val="Titolo3"/>
+        <w:pStyle w:val="Titolo2"/>
       </w:pPr>
       <w:r>
         <w:t>Coppa dei perdenti</w:t>
@@ -532,32 +538,12 @@
       <w:bookmarkEnd w:id="0"/>
     </w:p>
     <w:p>
-      <w:pPr>
-        <w:rPr>
-          <w:b/>
-          <w:bCs/>
-        </w:rPr>
-      </w:pPr>
-      <w:r>
-        <w:rPr>
-          <w:b/>
-          <w:bCs/>
-        </w:rPr>
+      <w:r>
         <w:t>Da quest’anno per aumentare l’interesse per il fantacalcio anche per le squadre inferiori si propone la Coppa dei Perdenti.</w:t>
       </w:r>
     </w:p>
     <w:p>
-      <w:pPr>
-        <w:rPr>
-          <w:b/>
-          <w:bCs/>
-        </w:rPr>
-      </w:pPr>
-      <w:r>
-        <w:rPr>
-          <w:b/>
-          <w:bCs/>
-        </w:rPr>
+      <w:r>
         <w:t>La Coppa prevede le seguenti partite:</w:t>
       </w:r>
     </w:p>
@@ -568,16 +554,8 @@
           <w:ilvl w:val="0"/>
           <w:numId w:val="1"/>
         </w:numPr>
-        <w:rPr>
-          <w:b/>
-          <w:bCs/>
-        </w:rPr>
-      </w:pPr>
-      <w:r>
-        <w:rPr>
-          <w:b/>
-          <w:bCs/>
-        </w:rPr>
+      </w:pPr>
+      <w:r>
         <w:t>Semifinale di andata (senza gol che vale doppio e senza fattore casalingo)</w:t>
       </w:r>
     </w:p>
@@ -588,16 +566,8 @@
           <w:ilvl w:val="0"/>
           <w:numId w:val="1"/>
         </w:numPr>
-        <w:rPr>
-          <w:b/>
-          <w:bCs/>
-        </w:rPr>
-      </w:pPr>
-      <w:r>
-        <w:rPr>
-          <w:b/>
-          <w:bCs/>
-        </w:rPr>
+      </w:pPr>
+      <w:r>
         <w:t>Semifinale di ritorno (senza gol che vale doppio e senza fattore casalingo)</w:t>
       </w:r>
     </w:p>
@@ -608,157 +578,55 @@
           <w:ilvl w:val="0"/>
           <w:numId w:val="1"/>
         </w:numPr>
+      </w:pPr>
+      <w:r>
+        <w:t>Finalissima unica senza fattore casalingo</w:t>
+      </w:r>
+    </w:p>
+    <w:p>
+      <w:r>
+        <w:t xml:space="preserve">Gli accoppiamenti saranno definiti alla fine della 32° giornata di </w:t>
+      </w:r>
+      <w:proofErr w:type="spellStart"/>
+      <w:r>
+        <w:t>fanta</w:t>
+      </w:r>
+      <w:proofErr w:type="spellEnd"/>
+      <w:r>
+        <w:t>-campionato.</w:t>
+      </w:r>
+    </w:p>
+    <w:p>
+      <w:r>
+        <w:t>Si scontreranno in semifinale andata e ritorno la 5° vs 8° e la 6° vs 7°.</w:t>
+      </w:r>
+    </w:p>
+    <w:p>
+      <w:r>
+        <w:t>Le vincenti si affronteranno in finale secca senza fattore casalingo.</w:t>
+      </w:r>
+    </w:p>
+    <w:p>
+      <w:r>
+        <w:t>Che premi prevede la Coppa dei perdenti? L’abbassamento della quota annuale del fantacalcio.</w:t>
+      </w:r>
+    </w:p>
+    <w:p>
+      <w:pPr>
         <w:rPr>
           <w:b/>
           <w:bCs/>
         </w:rPr>
       </w:pPr>
       <w:r>
+        <w:t>A fronte di una quota annuale di 120€ la ripartizione verrà così modificata</w:t>
+      </w:r>
+      <w:r>
         <w:rPr>
           <w:b/>
           <w:bCs/>
         </w:rPr>
-        <w:t>Finalissima unica senza fattore casalingo</w:t>
-      </w:r>
-    </w:p>
-    <w:p>
-      <w:pPr>
-        <w:rPr>
-          <w:b/>
-          <w:bCs/>
-        </w:rPr>
-      </w:pPr>
-      <w:r>
-        <w:rPr>
-          <w:b/>
-          <w:bCs/>
-        </w:rPr>
-        <w:t xml:space="preserve">Gli accoppiamenti saranno definiti </w:t>
-      </w:r>
-      <w:r>
-        <w:rPr>
-          <w:b/>
-          <w:bCs/>
-        </w:rPr>
-        <w:t xml:space="preserve">alla fine della 32° giornata di </w:t>
-      </w:r>
-      <w:proofErr w:type="spellStart"/>
-      <w:r>
-        <w:rPr>
-          <w:b/>
-          <w:bCs/>
-        </w:rPr>
-        <w:t>fanta</w:t>
-      </w:r>
-      <w:proofErr w:type="spellEnd"/>
-      <w:r>
-        <w:rPr>
-          <w:b/>
-          <w:bCs/>
-        </w:rPr>
-        <w:t>-campionato</w:t>
-      </w:r>
-      <w:r>
-        <w:rPr>
-          <w:b/>
-          <w:bCs/>
-        </w:rPr>
-        <w:t>.</w:t>
-      </w:r>
-    </w:p>
-    <w:p>
-      <w:pPr>
-        <w:rPr>
-          <w:b/>
-          <w:bCs/>
-        </w:rPr>
-      </w:pPr>
-      <w:r>
-        <w:rPr>
-          <w:b/>
-          <w:bCs/>
-        </w:rPr>
-        <w:t xml:space="preserve">Si scontreranno in semifinale </w:t>
-      </w:r>
-      <w:r>
-        <w:rPr>
-          <w:b/>
-          <w:bCs/>
-        </w:rPr>
-        <w:t xml:space="preserve">andata e ritorno </w:t>
-      </w:r>
-      <w:r>
-        <w:rPr>
-          <w:b/>
-          <w:bCs/>
-        </w:rPr>
-        <w:t xml:space="preserve">la </w:t>
-      </w:r>
-      <w:r>
-        <w:rPr>
-          <w:b/>
-          <w:bCs/>
-        </w:rPr>
-        <w:t>5° vs 8° e la 6° vs 7°.</w:t>
-      </w:r>
-    </w:p>
-    <w:p>
-      <w:pPr>
-        <w:rPr>
-          <w:b/>
-          <w:bCs/>
-        </w:rPr>
-      </w:pPr>
-      <w:r>
-        <w:rPr>
-          <w:b/>
-          <w:bCs/>
-        </w:rPr>
-        <w:t>Le vincenti si affronteranno in finale secca senza fattore casalingo.</w:t>
-      </w:r>
-    </w:p>
-    <w:p>
-      <w:pPr>
-        <w:rPr>
-          <w:b/>
-          <w:bCs/>
-        </w:rPr>
-      </w:pPr>
-      <w:r>
-        <w:rPr>
-          <w:b/>
-          <w:bCs/>
-        </w:rPr>
-        <w:t>Che premi prevede la Coppa dei perdenti? L’a</w:t>
-      </w:r>
-      <w:r>
-        <w:rPr>
-          <w:b/>
-          <w:bCs/>
-        </w:rPr>
-        <w:t>bbassamento</w:t>
-      </w:r>
-      <w:r>
-        <w:rPr>
-          <w:b/>
-          <w:bCs/>
-        </w:rPr>
-        <w:t xml:space="preserve"> della quota annuale del fantacalcio.</w:t>
-      </w:r>
-    </w:p>
-    <w:p>
-      <w:pPr>
-        <w:rPr>
-          <w:b/>
-          <w:bCs/>
-        </w:rPr>
-      </w:pPr>
-      <w:r>
-        <w:rPr>
-          <w:b/>
-          <w:bCs/>
-        </w:rPr>
-        <w:t>A fronte di una quota annuale di 120€ la ripartizione verrà così modificata:</w:t>
+        <w:t>:</w:t>
       </w:r>
     </w:p>
     <w:tbl>
@@ -920,103 +788,13 @@
       </w:pPr>
     </w:p>
     <w:p>
-      <w:pPr>
-        <w:rPr>
-          <w:b/>
-          <w:bCs/>
-        </w:rPr>
-      </w:pPr>
-      <w:r>
-        <w:rPr>
-          <w:b/>
-          <w:bCs/>
-        </w:rPr>
+      <w:r>
         <w:t>Le spese di mercato e le multe non vengono conteggiate nella suddivisione suddetta</w:t>
       </w:r>
     </w:p>
     <w:p>
-      <w:pPr>
-        <w:rPr>
-          <w:b/>
-          <w:bCs/>
-        </w:rPr>
-      </w:pPr>
-      <w:r>
-        <w:rPr>
-          <w:b/>
-          <w:bCs/>
-        </w:rPr>
-        <w:t>Per l</w:t>
-      </w:r>
-      <w:r>
-        <w:rPr>
-          <w:b/>
-          <w:bCs/>
-        </w:rPr>
-        <w:t xml:space="preserve">a coppa dei perdenti </w:t>
-      </w:r>
-      <w:r>
-        <w:rPr>
-          <w:b/>
-          <w:bCs/>
-        </w:rPr>
-        <w:t xml:space="preserve">in caso non venga consegnata la formazione </w:t>
-      </w:r>
-      <w:r>
-        <w:rPr>
-          <w:b/>
-          <w:bCs/>
-        </w:rPr>
-        <w:t xml:space="preserve">viene </w:t>
-      </w:r>
-      <w:r>
-        <w:rPr>
-          <w:b/>
-          <w:bCs/>
-        </w:rPr>
-        <w:t>previst</w:t>
-      </w:r>
-      <w:r>
-        <w:rPr>
-          <w:b/>
-          <w:bCs/>
-        </w:rPr>
-        <w:t>a</w:t>
-      </w:r>
-      <w:r>
-        <w:rPr>
-          <w:b/>
-          <w:bCs/>
-        </w:rPr>
-        <w:t xml:space="preserve"> </w:t>
-      </w:r>
-      <w:r>
-        <w:rPr>
-          <w:b/>
-          <w:bCs/>
-        </w:rPr>
-        <w:t xml:space="preserve">la </w:t>
-      </w:r>
-      <w:r>
-        <w:rPr>
-          <w:b/>
-          <w:bCs/>
-        </w:rPr>
-        <w:t>mult</w:t>
-      </w:r>
-      <w:r>
-        <w:rPr>
-          <w:b/>
-          <w:bCs/>
-        </w:rPr>
-        <w:t>a ma</w:t>
-      </w:r>
-      <w:r>
-        <w:rPr>
-          <w:b/>
-          <w:bCs/>
-        </w:rPr>
-        <w:t xml:space="preserve"> la partita si giocherà regolarmente inserendo la formazione precedentemente rilasciata.</w:t>
+      <w:r>
+        <w:t>Per la coppa dei perdenti in caso non venga consegnata la formazione viene prevista la multa ma la partita si giocherà regolarmente inserendo la formazione precedentemente rilasciata.</w:t>
       </w:r>
     </w:p>
     <w:p/>
@@ -1555,6 +1333,178 @@
     </w:lvl>
   </w:abstractNum>
   <w:abstractNum w:abstractNumId="4" w15:restartNumberingAfterBreak="0">
+    <w:nsid w:val="47BB05ED"/>
+    <w:multiLevelType w:val="hybridMultilevel"/>
+    <w:tmpl w:val="45D6923C"/>
+    <w:lvl w:ilvl="0" w:tplc="FFFFFFFF">
+      <w:start w:val="1"/>
+      <w:numFmt w:val="decimal"/>
+      <w:lvlText w:val="%1."/>
+      <w:lvlJc w:val="left"/>
+      <w:pPr>
+        <w:ind w:left="360" w:hanging="360"/>
+      </w:pPr>
+    </w:lvl>
+    <w:lvl w:ilvl="1" w:tplc="FFFFFFFF" w:tentative="1">
+      <w:start w:val="1"/>
+      <w:numFmt w:val="lowerLetter"/>
+      <w:lvlText w:val="%2."/>
+      <w:lvlJc w:val="left"/>
+      <w:pPr>
+        <w:ind w:left="1080" w:hanging="360"/>
+      </w:pPr>
+    </w:lvl>
+    <w:lvl w:ilvl="2" w:tplc="FFFFFFFF" w:tentative="1">
+      <w:start w:val="1"/>
+      <w:numFmt w:val="lowerRoman"/>
+      <w:lvlText w:val="%3."/>
+      <w:lvlJc w:val="right"/>
+      <w:pPr>
+        <w:ind w:left="1800" w:hanging="180"/>
+      </w:pPr>
+    </w:lvl>
+    <w:lvl w:ilvl="3" w:tplc="FFFFFFFF" w:tentative="1">
+      <w:start w:val="1"/>
+      <w:numFmt w:val="decimal"/>
+      <w:lvlText w:val="%4."/>
+      <w:lvlJc w:val="left"/>
+      <w:pPr>
+        <w:ind w:left="2520" w:hanging="360"/>
+      </w:pPr>
+    </w:lvl>
+    <w:lvl w:ilvl="4" w:tplc="FFFFFFFF" w:tentative="1">
+      <w:start w:val="1"/>
+      <w:numFmt w:val="lowerLetter"/>
+      <w:lvlText w:val="%5."/>
+      <w:lvlJc w:val="left"/>
+      <w:pPr>
+        <w:ind w:left="3240" w:hanging="360"/>
+      </w:pPr>
+    </w:lvl>
+    <w:lvl w:ilvl="5" w:tplc="FFFFFFFF" w:tentative="1">
+      <w:start w:val="1"/>
+      <w:numFmt w:val="lowerRoman"/>
+      <w:lvlText w:val="%6."/>
+      <w:lvlJc w:val="right"/>
+      <w:pPr>
+        <w:ind w:left="3960" w:hanging="180"/>
+      </w:pPr>
+    </w:lvl>
+    <w:lvl w:ilvl="6" w:tplc="FFFFFFFF" w:tentative="1">
+      <w:start w:val="1"/>
+      <w:numFmt w:val="decimal"/>
+      <w:lvlText w:val="%7."/>
+      <w:lvlJc w:val="left"/>
+      <w:pPr>
+        <w:ind w:left="4680" w:hanging="360"/>
+      </w:pPr>
+    </w:lvl>
+    <w:lvl w:ilvl="7" w:tplc="FFFFFFFF" w:tentative="1">
+      <w:start w:val="1"/>
+      <w:numFmt w:val="lowerLetter"/>
+      <w:lvlText w:val="%8."/>
+      <w:lvlJc w:val="left"/>
+      <w:pPr>
+        <w:ind w:left="5400" w:hanging="360"/>
+      </w:pPr>
+    </w:lvl>
+    <w:lvl w:ilvl="8" w:tplc="FFFFFFFF" w:tentative="1">
+      <w:start w:val="1"/>
+      <w:numFmt w:val="lowerRoman"/>
+      <w:lvlText w:val="%9."/>
+      <w:lvlJc w:val="right"/>
+      <w:pPr>
+        <w:ind w:left="6120" w:hanging="180"/>
+      </w:pPr>
+    </w:lvl>
+  </w:abstractNum>
+  <w:abstractNum w:abstractNumId="5" w15:restartNumberingAfterBreak="0">
+    <w:nsid w:val="5CD80F6D"/>
+    <w:multiLevelType w:val="hybridMultilevel"/>
+    <w:tmpl w:val="45D6923C"/>
+    <w:lvl w:ilvl="0" w:tplc="0410000F">
+      <w:start w:val="1"/>
+      <w:numFmt w:val="decimal"/>
+      <w:lvlText w:val="%1."/>
+      <w:lvlJc w:val="left"/>
+      <w:pPr>
+        <w:ind w:left="360" w:hanging="360"/>
+      </w:pPr>
+    </w:lvl>
+    <w:lvl w:ilvl="1" w:tplc="04100019" w:tentative="1">
+      <w:start w:val="1"/>
+      <w:numFmt w:val="lowerLetter"/>
+      <w:lvlText w:val="%2."/>
+      <w:lvlJc w:val="left"/>
+      <w:pPr>
+        <w:ind w:left="1080" w:hanging="360"/>
+      </w:pPr>
+    </w:lvl>
+    <w:lvl w:ilvl="2" w:tplc="0410001B" w:tentative="1">
+      <w:start w:val="1"/>
+      <w:numFmt w:val="lowerRoman"/>
+      <w:lvlText w:val="%3."/>
+      <w:lvlJc w:val="right"/>
+      <w:pPr>
+        <w:ind w:left="1800" w:hanging="180"/>
+      </w:pPr>
+    </w:lvl>
+    <w:lvl w:ilvl="3" w:tplc="0410000F" w:tentative="1">
+      <w:start w:val="1"/>
+      <w:numFmt w:val="decimal"/>
+      <w:lvlText w:val="%4."/>
+      <w:lvlJc w:val="left"/>
+      <w:pPr>
+        <w:ind w:left="2520" w:hanging="360"/>
+      </w:pPr>
+    </w:lvl>
+    <w:lvl w:ilvl="4" w:tplc="04100019" w:tentative="1">
+      <w:start w:val="1"/>
+      <w:numFmt w:val="lowerLetter"/>
+      <w:lvlText w:val="%5."/>
+      <w:lvlJc w:val="left"/>
+      <w:pPr>
+        <w:ind w:left="3240" w:hanging="360"/>
+      </w:pPr>
+    </w:lvl>
+    <w:lvl w:ilvl="5" w:tplc="0410001B" w:tentative="1">
+      <w:start w:val="1"/>
+      <w:numFmt w:val="lowerRoman"/>
+      <w:lvlText w:val="%6."/>
+      <w:lvlJc w:val="right"/>
+      <w:pPr>
+        <w:ind w:left="3960" w:hanging="180"/>
+      </w:pPr>
+    </w:lvl>
+    <w:lvl w:ilvl="6" w:tplc="0410000F" w:tentative="1">
+      <w:start w:val="1"/>
+      <w:numFmt w:val="decimal"/>
+      <w:lvlText w:val="%7."/>
+      <w:lvlJc w:val="left"/>
+      <w:pPr>
+        <w:ind w:left="4680" w:hanging="360"/>
+      </w:pPr>
+    </w:lvl>
+    <w:lvl w:ilvl="7" w:tplc="04100019" w:tentative="1">
+      <w:start w:val="1"/>
+      <w:numFmt w:val="lowerLetter"/>
+      <w:lvlText w:val="%8."/>
+      <w:lvlJc w:val="left"/>
+      <w:pPr>
+        <w:ind w:left="5400" w:hanging="360"/>
+      </w:pPr>
+    </w:lvl>
+    <w:lvl w:ilvl="8" w:tplc="0410001B" w:tentative="1">
+      <w:start w:val="1"/>
+      <w:numFmt w:val="lowerRoman"/>
+      <w:lvlText w:val="%9."/>
+      <w:lvlJc w:val="right"/>
+      <w:pPr>
+        <w:ind w:left="6120" w:hanging="180"/>
+      </w:pPr>
+    </w:lvl>
+  </w:abstractNum>
+  <w:abstractNum w:abstractNumId="6" w15:restartNumberingAfterBreak="0">
     <w:nsid w:val="7F71770B"/>
     <w:multiLevelType w:val="multilevel"/>
     <w:tmpl w:val="81D439E6"/>
@@ -1574,7 +1524,7 @@
         <w:sz w:val="20"/>
       </w:rPr>
     </w:lvl>
-    <w:lvl w:ilvl="1" w:tentative="1">
+    <w:lvl w:ilvl="1">
       <w:start w:val="1"/>
       <w:numFmt w:val="bullet"/>
       <w:lvlText w:val="o"/>
@@ -1710,13 +1660,19 @@
     <w:abstractNumId w:val="3"/>
   </w:num>
   <w:num w:numId="3" w16cid:durableId="1545756136">
-    <w:abstractNumId w:val="4"/>
+    <w:abstractNumId w:val="6"/>
   </w:num>
   <w:num w:numId="4" w16cid:durableId="954557247">
     <w:abstractNumId w:val="2"/>
   </w:num>
   <w:num w:numId="5" w16cid:durableId="799768450">
     <w:abstractNumId w:val="1"/>
+  </w:num>
+  <w:num w:numId="6" w16cid:durableId="1807358816">
+    <w:abstractNumId w:val="5"/>
+  </w:num>
+  <w:num w:numId="7" w16cid:durableId="95486717">
+    <w:abstractNumId w:val="4"/>
   </w:num>
 </w:numbering>
 </file>
@@ -2332,6 +2288,7 @@
   <w:style w:type="character" w:default="1" w:styleId="Carpredefinitoparagrafo">
     <w:name w:val="Default Paragraph Font"/>
     <w:uiPriority w:val="1"/>
+    <w:semiHidden/>
     <w:unhideWhenUsed/>
   </w:style>
   <w:style w:type="table" w:default="1" w:styleId="Tabellanormale">

</xml_diff>